<commit_message>
docs: adjust some names variables in document
</commit_message>
<xml_diff>
--- a/src/templates/documents/declaracao_hipossuficiencia.docx
+++ b/src/templates/documents/declaracao_hipossuficiencia.docx
@@ -110,7 +110,7 @@
           </mc:Choice>
           <mc:Fallback>
             <w:pict>
-              <v:group w14:anchorId="23F9B991" id="Group 1" o:spid="_x0000_s1026" style="position:absolute;margin-left:6.75pt;margin-top:21.35pt;width:586.15pt;height:819.85pt;z-index:-15752192;mso-wrap-distance-left:0;mso-wrap-distance-right:0;mso-position-horizontal-relative:page;mso-position-vertical-relative:page" coordsize="74441,104120" o:gfxdata="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">
+              <v:group w14:anchorId="165A4CA1" id="Group 1" o:spid="_x0000_s1026" style="position:absolute;margin-left:6.75pt;margin-top:21.35pt;width:586.15pt;height:819.85pt;z-index:-15752192;mso-wrap-distance-left:0;mso-wrap-distance-right:0;mso-position-horizontal-relative:page;mso-position-vertical-relative:page" coordsize="74441,104120" o:gfxdata="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">
                 <v:shapetype id="_x0000_t75" coordsize="21600,21600" o:spt="75" o:preferrelative="t" path="m@4@5l@4@11@9@11@9@5xe" filled="f" stroked="f">
                   <v:stroke joinstyle="miter"/>
                   <v:formulas>
@@ -195,7 +195,21 @@
         <w:rPr>
           <w:w w:val="105"/>
         </w:rPr>
-        <w:t>{{name}</w:t>
+        <w:t>{{</w:t>
+      </w:r>
+      <w:proofErr w:type="spellStart"/>
+      <w:r>
+        <w:rPr>
+          <w:w w:val="105"/>
+        </w:rPr>
+        <w:t>name</w:t>
+      </w:r>
+      <w:proofErr w:type="spellEnd"/>
+      <w:r>
+        <w:rPr>
+          <w:w w:val="105"/>
+        </w:rPr>
+        <w:t>}</w:t>
       </w:r>
       <w:proofErr w:type="gramStart"/>
       <w:r>
@@ -221,7 +235,21 @@
         <w:rPr>
           <w:w w:val="105"/>
         </w:rPr>
-        <w:t>{{civilstatus}}</w:t>
+        <w:t>{{</w:t>
+      </w:r>
+      <w:proofErr w:type="spellStart"/>
+      <w:r>
+        <w:rPr>
+          <w:w w:val="105"/>
+        </w:rPr>
+        <w:t>civilstatus</w:t>
+      </w:r>
+      <w:proofErr w:type="spellEnd"/>
+      <w:r>
+        <w:rPr>
+          <w:w w:val="105"/>
+        </w:rPr>
+        <w:t>}}</w:t>
       </w:r>
       <w:r>
         <w:rPr>
@@ -233,7 +261,21 @@
         <w:rPr>
           <w:w w:val="105"/>
         </w:rPr>
-        <w:t>{{occupation}}</w:t>
+        <w:t>{{</w:t>
+      </w:r>
+      <w:proofErr w:type="spellStart"/>
+      <w:r>
+        <w:rPr>
+          <w:w w:val="105"/>
+        </w:rPr>
+        <w:t>occupation</w:t>
+      </w:r>
+      <w:proofErr w:type="spellEnd"/>
+      <w:r>
+        <w:rPr>
+          <w:w w:val="105"/>
+        </w:rPr>
+        <w:t>}}</w:t>
       </w:r>
       <w:r>
         <w:rPr>
@@ -245,7 +287,21 @@
         <w:rPr>
           <w:w w:val="105"/>
         </w:rPr>
-        <w:t>{{identification}}</w:t>
+        <w:t>{{</w:t>
+      </w:r>
+      <w:proofErr w:type="spellStart"/>
+      <w:r>
+        <w:rPr>
+          <w:w w:val="105"/>
+        </w:rPr>
+        <w:t>identification</w:t>
+      </w:r>
+      <w:proofErr w:type="spellEnd"/>
+      <w:r>
+        <w:rPr>
+          <w:w w:val="105"/>
+        </w:rPr>
+        <w:t>}}</w:t>
       </w:r>
       <w:r>
         <w:rPr>
@@ -289,7 +345,21 @@
         <w:rPr>
           <w:w w:val="105"/>
         </w:rPr>
-        <w:t>{{region}}</w:t>
+        <w:t>{{</w:t>
+      </w:r>
+      <w:proofErr w:type="spellStart"/>
+      <w:r>
+        <w:rPr>
+          <w:w w:val="105"/>
+        </w:rPr>
+        <w:t>region</w:t>
+      </w:r>
+      <w:proofErr w:type="spellEnd"/>
+      <w:r>
+        <w:rPr>
+          <w:w w:val="105"/>
+        </w:rPr>
+        <w:t>}}</w:t>
       </w:r>
       <w:r>
         <w:rPr>
@@ -301,7 +371,21 @@
         <w:rPr>
           <w:w w:val="105"/>
         </w:rPr>
-        <w:t>{{city}}</w:t>
+        <w:t>{{</w:t>
+      </w:r>
+      <w:proofErr w:type="spellStart"/>
+      <w:r>
+        <w:rPr>
+          <w:w w:val="105"/>
+        </w:rPr>
+        <w:t>city</w:t>
+      </w:r>
+      <w:proofErr w:type="spellEnd"/>
+      <w:r>
+        <w:rPr>
+          <w:w w:val="105"/>
+        </w:rPr>
+        <w:t>}}</w:t>
       </w:r>
       <w:r>
         <w:rPr>
@@ -320,7 +404,21 @@
         <w:rPr>
           <w:w w:val="105"/>
         </w:rPr>
-        <w:t>{{state}}</w:t>
+        <w:t>{{</w:t>
+      </w:r>
+      <w:proofErr w:type="spellStart"/>
+      <w:r>
+        <w:rPr>
+          <w:w w:val="105"/>
+        </w:rPr>
+        <w:t>state</w:t>
+      </w:r>
+      <w:proofErr w:type="spellEnd"/>
+      <w:r>
+        <w:rPr>
+          <w:w w:val="105"/>
+        </w:rPr>
+        <w:t>}}</w:t>
       </w:r>
       <w:r>
         <w:rPr>
@@ -335,11 +433,19 @@
         </w:rPr>
         <w:t xml:space="preserve"> </w:t>
       </w:r>
-      <w:r>
-        <w:rPr>
-          <w:w w:val="105"/>
-        </w:rPr>
-        <w:t>art.</w:t>
+      <w:proofErr w:type="spellStart"/>
+      <w:r>
+        <w:rPr>
+          <w:w w:val="105"/>
+        </w:rPr>
+        <w:t>art</w:t>
+      </w:r>
+      <w:proofErr w:type="spellEnd"/>
+      <w:r>
+        <w:rPr>
+          <w:w w:val="105"/>
+        </w:rPr>
+        <w:t>.</w:t>
       </w:r>
       <w:r>
         <w:rPr>
@@ -430,7 +536,21 @@
         <w:rPr>
           <w:w w:val="105"/>
         </w:rPr>
-        <w:t>e da Lei nª 1.060/50. Requer, ainda, que o benefício abranja a todos os atos do processo, na forma do art. 98 do Código de Processo Civil.</w:t>
+        <w:t xml:space="preserve">e da Lei nª 1.060/50. Requer, ainda, que o benefício abranja a todos os atos do processo, na forma do </w:t>
+      </w:r>
+      <w:proofErr w:type="spellStart"/>
+      <w:r>
+        <w:rPr>
+          <w:w w:val="105"/>
+        </w:rPr>
+        <w:t>art</w:t>
+      </w:r>
+      <w:proofErr w:type="spellEnd"/>
+      <w:r>
+        <w:rPr>
+          <w:w w:val="105"/>
+        </w:rPr>
+        <w:t>. 98 do Código de Processo Civil.</w:t>
       </w:r>
     </w:p>
     <w:p>
@@ -564,14 +684,41 @@
         <w:jc w:val="center"/>
         <w:rPr>
           <w:rFonts w:ascii="Arial MT"/>
-        </w:rPr>
-      </w:pPr>
-      <w:r>
-        <w:rPr>
-          <w:rFonts w:ascii="Arial MT"/>
           <w:spacing w:val="-4"/>
         </w:rPr>
-        <w:t>{{name}}</w:t>
+      </w:pPr>
+    </w:p>
+    <w:p>
+      <w:pPr>
+        <w:pStyle w:val="Corpodetexto"/>
+        <w:ind w:left="126"/>
+        <w:jc w:val="center"/>
+        <w:rPr>
+          <w:rFonts w:ascii="Arial MT"/>
+        </w:rPr>
+      </w:pPr>
+      <w:r>
+        <w:rPr>
+          <w:rFonts w:ascii="Arial MT"/>
+          <w:spacing w:val="-4"/>
+        </w:rPr>
+        <w:t>{{</w:t>
+      </w:r>
+      <w:proofErr w:type="spellStart"/>
+      <w:r>
+        <w:rPr>
+          <w:rFonts w:ascii="Arial MT"/>
+          <w:spacing w:val="-4"/>
+        </w:rPr>
+        <w:t>name</w:t>
+      </w:r>
+      <w:proofErr w:type="spellEnd"/>
+      <w:r>
+        <w:rPr>
+          <w:rFonts w:ascii="Arial MT"/>
+          <w:spacing w:val="-4"/>
+        </w:rPr>
+        <w:t>}}</w:t>
       </w:r>
     </w:p>
     <w:sectPr>

</xml_diff>